<commit_message>
Replace the database backup with the 2026-08-31 dump
The old 2026-08-24 archive is removed. Both places that named the backup by
filename are updated: the runbook still pointed at 2026-08-14, two generations
back, and the spec builder at 2026-08-24. The inner directory name carries the
timestamp too, so the quoted pg_restore path changes with it.

Verified: 46 data files for the schema's 46 tables.

Co-Authored-By: Claude Opus 5 <noreply@anthropic.com>
</commit_message>
<xml_diff>
--- a/docs/PracticeLab_Data_Architecture_and_Migration.docx
+++ b/docs/PracticeLab_Data_Architecture_and_Migration.docx
@@ -90,7 +90,7 @@
           <w:sz w:val="19"/>
           <w:szCs w:val="19"/>
         </w:rPr>
-        <w:t xml:space="preserve">Version 1.0  ·  24 August 2026</w:t>
+        <w:t xml:space="preserve">Version 1.0  ·  31 August 2026</w:t>
       </w:r>
     </w:p>
     <w:p>
@@ -7125,7 +7125,7 @@
           <w:sz w:val="18"/>
           <w:szCs w:val="18"/>
         </w:rPr>
-        <w:t xml:space="preserve">tar -xzf 2026-08-24T10_14Z.dir.tar.gz</w:t>
+        <w:t xml:space="preserve">tar -xzf 2026-08-31T16_37Z.dir.tar.gz</w:t>
       </w:r>
     </w:p>
     <w:p>
@@ -7232,7 +7232,7 @@
           <w:sz w:val="18"/>
           <w:szCs w:val="18"/>
         </w:rPr>
-        <w:t xml:space="preserve">  "2026-08-24T10:14Z/chartviewer"</w:t>
+        <w:t xml:space="preserve">  "2026-08-31T16:37Z/chartviewer"</w:t>
       </w:r>
     </w:p>
     <w:p>

</xml_diff>